<commit_message>
feat: agregar inventario y simplificar captura de ventas
Permite controlar existencias con kardex y registrar ventas por clase sin calidad, creando catálogos al vuelo.

Co-authored-by: Cursor <cursoragent@cursor.com>
</commit_message>
<xml_diff>
--- a/Manual_de_Usuario.docx
+++ b/Manual_de_Usuario.docx
@@ -1033,7 +1033,7 @@
                 <w:b w:val="false"/>
                 <w:bCs w:val="false"/>
               </w:rPr>
-              <w:t xml:space="preserve">Suma de los importes (kilos x precio) de las ventas del día seleccionado.</w:t>
+              <w:t xml:space="preserve">Suma de los importes (bolsas x kilos x precio) de las ventas del día seleccionado.</w:t>
             </w:r>
           </w:p>
         </w:tc>
@@ -1221,7 +1221,7 @@
                 <w:b w:val="false"/>
                 <w:bCs w:val="false"/>
               </w:rPr>
-              <w:t xml:space="preserve">Elegir de la lista desplegable.</w:t>
+              <w:t xml:space="preserve">Escribir el nombre del comprador (por ejemplo "Juan Pérez").</w:t>
             </w:r>
           </w:p>
         </w:tc>
@@ -1265,7 +1265,7 @@
                 <w:b w:val="false"/>
                 <w:bCs w:val="false"/>
               </w:rPr>
-              <w:t xml:space="preserve">Elegir de la lista desplegable.</w:t>
+              <w:t xml:space="preserve">Escribir la clase (por ejemplo "Arroz").</w:t>
             </w:r>
           </w:p>
         </w:tc>
@@ -1309,7 +1309,7 @@
                 <w:b w:val="false"/>
                 <w:bCs w:val="false"/>
               </w:rPr>
-              <w:t xml:space="preserve">Elegir de la lista desplegable.</w:t>
+              <w:t xml:space="preserve">Escribir la calidad (por ejemplo "Extra").</w:t>
             </w:r>
           </w:p>
         </w:tc>
@@ -1397,7 +1397,7 @@
                 <w:b w:val="false"/>
                 <w:bCs w:val="false"/>
               </w:rPr>
-              <w:t xml:space="preserve">Kilos de la venta (número con hasta 3 decimales).</w:t>
+              <w:t xml:space="preserve">Kilos por bolsa (número con hasta 3 decimales).</w:t>
             </w:r>
           </w:p>
         </w:tc>
@@ -1529,7 +1529,7 @@
                 <w:b w:val="false"/>
                 <w:bCs w:val="false"/>
               </w:rPr>
-              <w:t xml:space="preserve">Kilos x Precio. Se calcula solo; no se edita.</w:t>
+              <w:t xml:space="preserve">Bolsas x Kilos x Precio. Se calcula solo; no se edita.</w:t>
             </w:r>
           </w:p>
         </w:tc>
@@ -1593,7 +1593,7 @@
         </w:tc>
       </w:tr>
     </w:tbl>
-    <w:p>Al pasar de una celda a otra con la tecla Tab o haciendo clic, el cambio queda capturado. Para editar una celda ya llenada, hacer clic sobre ella y reescribir el valor.</w:p>
+    <w:p>Al pasar de una celda a otra con la tecla Tab o haciendo clic, el cambio queda capturado. Para editar una celda ya llenada, hacer clic sobre ella y reescribir el valor. Cada persona se escribe tal cual se quiere que quede guardada (respetar mayúsculas y minúsculas; el sistema diferencia "arroz" de "Arroz").</w:p>
     <w:p>
       <w:pPr>
         <w:pStyle w:val="Heading2"/>
@@ -1603,7 +1603,7 @@
         <w:t xml:space="preserve">6.3 El último precio y la alerta</w:t>
       </w:r>
     </w:p>
-    <w:p>En cuanto se elige la clase y la calidad, el sistema consulta el último precio registrado de esa combinación y lo muestra en la columna «Último».</w:p>
+    <w:p>En cuanto se escribe la clase y la calidad, el sistema consulta el último precio registrado de esa combinación y lo muestra en la columna «Último».</w:p>
     <w:p>Si el precio escrito se aleja del último en más del umbral permitido (20% por defecto), la celda de Precio se marca en color rojo para indicar que hay una alerta.</w:p>
     <w:p>No es un error: alerta simplemente avisa que el precio cambió mucho respecto al anterior.</w:p>
     <w:p>
@@ -2036,7 +2036,7 @@
                 <w:b w:val="false"/>
                 <w:bCs w:val="false"/>
               </w:rPr>
-              <w:t xml:space="preserve">Importe (kilos x precio)</w:t>
+              <w:t xml:space="preserve">Importe (bolsas x kilos x precio)</w:t>
             </w:r>
           </w:p>
         </w:tc>
@@ -2128,87 +2128,45 @@
         <w:t xml:space="preserve">8. Catálogos (compradores, clases y calidades)</w:t>
       </w:r>
     </w:p>
-    <w:p>Las listas desplegables de comprador, clase y calidad se alimentan de las tablas de catálogo. Al instalar el sistema por primera vez, estos catálogos están vacíos a propósito: es el usuario quien agrega sus propios compradores, clases y calidades antes de capturar.</w:p>
-    <w:p>La versión actual no tiene pantalla para administrarlos; se administran directamente en la base de datos.</w:p>
-    <w:p>Para agregar un comprador, una clase o una calidad, abrir la consola de base de datos (sección 9) y ejecutar:</w:p>
-    <w:p>
-      <w:pPr>
-        <w:pStyle w:val="Heading3"/>
-        <w:spacing w:after="100" w:before="180"/>
-      </w:pPr>
-      <w:r>
-        <w:t xml:space="preserve">Agregar un comprador</w:t>
-      </w:r>
-    </w:p>
-    <w:p>
-      <w:pPr>
-        <w:spacing w:after="120" w:before="60"/>
-        <w:ind w:left="300"/>
-      </w:pPr>
-      <w:r>
-        <w:rPr>
-          <w:rFonts w:ascii="Consolas" w:cs="Consolas" w:eastAsia="Consolas" w:hAnsi="Consolas"/>
-          <w:sz w:val="20"/>
-          <w:szCs w:val="20"/>
-        </w:rPr>
-        <w:t xml:space="preserve">INSERT INTO compradores (nombre) VALUES ('Nombre del comprador');</w:t>
-      </w:r>
-    </w:p>
-    <w:p>
-      <w:pPr>
-        <w:pStyle w:val="Heading3"/>
-        <w:spacing w:after="100" w:before="180"/>
-      </w:pPr>
-      <w:r>
-        <w:t xml:space="preserve">Agregar una clase</w:t>
-      </w:r>
-    </w:p>
-    <w:p>
-      <w:pPr>
-        <w:spacing w:after="120" w:before="60"/>
-        <w:ind w:left="300"/>
-      </w:pPr>
-      <w:r>
-        <w:rPr>
-          <w:rFonts w:ascii="Consolas" w:cs="Consolas" w:eastAsia="Consolas" w:hAnsi="Consolas"/>
-          <w:sz w:val="20"/>
-          <w:szCs w:val="20"/>
-        </w:rPr>
-        <w:t xml:space="preserve">INSERT INTO clases (nombre_clase) VALUES ('Nombre de la clase');</w:t>
-      </w:r>
-    </w:p>
-    <w:p>
-      <w:pPr>
-        <w:pStyle w:val="Heading3"/>
-        <w:spacing w:after="100" w:before="180"/>
-      </w:pPr>
-      <w:r>
-        <w:t xml:space="preserve">Agregar una calidad</w:t>
-      </w:r>
-    </w:p>
-    <w:p>
-      <w:pPr>
-        <w:spacing w:after="120" w:before="60"/>
-        <w:ind w:left="300"/>
-      </w:pPr>
-      <w:r>
-        <w:rPr>
-          <w:rFonts w:ascii="Consolas" w:cs="Consolas" w:eastAsia="Consolas" w:hAnsi="Consolas"/>
-          <w:sz w:val="20"/>
-          <w:szCs w:val="20"/>
-        </w:rPr>
-        <w:t xml:space="preserve">INSERT INTO calidades (nombre_calidad) VALUES ('Nombre de la calidad');</w:t>
-      </w:r>
-    </w:p>
-    <w:p>
-      <w:pPr>
-        <w:pStyle w:val="Heading3"/>
-        <w:spacing w:after="100" w:before="180"/>
-      </w:pPr>
-      <w:r>
-        <w:t xml:space="preserve">Ver los catálogos existentes</w:t>
-      </w:r>
-    </w:p>
+    <w:p>No hay que cargar listas antes de capturar: comprador, clase y calidad se escriben en texto libre en la captura y el sistema los guarda automáticamente en el catálogo la primera vez que se registra una venta con ese nombre.</w:p>
+    <w:p>Por ejemplo, si en la captura se escribe "Arroz" como clase y se guarda, a partir de ese momento "Arroz" queda registrado como una clase del sistema.</w:p>
+    <w:p>Consejos de uso:</w:p>
+    <w:p>
+      <w:pPr>
+        <w:pStyle w:val="ListParagraph"/>
+        <w:numPr>
+          <w:ilvl w:val="0"/>
+          <w:numId w:val="1"/>
+        </w:numPr>
+        <w:spacing w:after="60"/>
+      </w:pPr>
+      <w:r>
+        <w:t xml:space="preserve">Usar siempre la misma forma de escribir cada nombre (mayúsculas y minúsculas) para que no se dupliquen ("Arroz" y "arroz" se guardarían como dos clases distintas).</w:t>
+      </w:r>
+    </w:p>
+    <w:p>
+      <w:pPr>
+        <w:pStyle w:val="ListParagraph"/>
+        <w:numPr>
+          <w:ilvl w:val="0"/>
+          <w:numId w:val="1"/>
+        </w:numPr>
+        <w:spacing w:after="60"/>
+      </w:pPr>
+      <w:r>
+        <w:t xml:space="preserve">No es necesario llenar los catálogos de antemano; se van formando solos con las ventas.</w:t>
+      </w:r>
+    </w:p>
+    <w:p>
+      <w:pPr>
+        <w:pStyle w:val="Heading2"/>
+        <w:spacing w:after="120" w:before="240"/>
+      </w:pPr>
+      <w:r>
+        <w:t xml:space="preserve">Ver los catálogos guardados</w:t>
+      </w:r>
+    </w:p>
+    <w:p>Los catálogos no tienen pantalla de consulta propia; se pueden revisar desde la consola de base de datos (sección 9) ejecutando:</w:p>
     <w:p>
       <w:pPr>
         <w:spacing w:after="120" w:before="60"/>
@@ -2251,7 +2209,7 @@
         <w:t xml:space="preserve">SELECT id, nombre_calidad FROM calidades ORDER BY nombre_calidad;</w:t>
       </w:r>
     </w:p>
-    <w:p>Después de agregar valores, refrescar la página del navegador (F5) para que las listas se actualicen.</w:p>
+    <w:p>Si se necesita corregir un nombre mal escrito o eliminar un valor del catálogo, contactar al proveedor: esos cambios van ligados a las ventas ya guardadas y deben hacerse con cuidado.</w:p>
     <w:p>
       <w:pPr>
         <w:pStyle w:val="Heading1"/>
@@ -2884,21 +2842,21 @@
                 <w:b w:val="false"/>
                 <w:bCs w:val="false"/>
               </w:rPr>
-              <w:t xml:space="preserve">Los catálogos están vacíos</w:t>
-            </w:r>
-          </w:p>
-        </w:tc>
-        <w:tc>
-          <w:p>
-            <w:pPr>
-              <w:spacing w:after="40"/>
-            </w:pPr>
-            <w:r>
-              <w:rPr>
-                <w:b w:val="false"/>
-                <w:bCs w:val="false"/>
-              </w:rPr>
-              <w:t xml:space="preserve">Refrescar la página (F5). Si siguen vacíos, agregar valores en la base (sección 8).</w:t>
+              <w:t xml:space="preserve">Un nombre del catálogo quedó mal escrito o se duplicó (por mayúsculas)</w:t>
+            </w:r>
+          </w:p>
+        </w:tc>
+        <w:tc>
+          <w:p>
+            <w:pPr>
+              <w:spacing w:after="40"/>
+            </w:pPr>
+            <w:r>
+              <w:rPr>
+                <w:b w:val="false"/>
+                <w:bCs w:val="false"/>
+              </w:rPr>
+              <w:t xml:space="preserve">Contactar al proveedor para corregirlo sin afectar las ventas guardadas.</w:t>
             </w:r>
           </w:p>
         </w:tc>

</xml_diff>